<commit_message>
fix+feat: PAT-06 hardcode recipient, sidebar redesign, gunicorn timeout
- PAT-06 template: replace {{ Responsable }} block with Dr. Gerardo Villacreses
  (Director de Posgrado, Cooperación y Relaciones Internacionales, ULEAM) - always fixed
- Sidebar: accordion mode (one group open at a time), friendly typography (no uppercase),
  smooth CSS transitions, mobile overlay, active button highlight
- gunicorn.conf.py: timeout=300s to prevent 500 errors on long AssemblyAI transcriptions

Co-Authored-By: Claude Sonnet 4.6 <noreply@anthropic.com>
</commit_message>
<xml_diff>
--- a/resources/PAT-03-G-001-F-006.docx
+++ b/resources/PAT-03-G-001-F-006.docx
@@ -96,7 +96,7 @@
           <w:sz w:val="22"/>
           <w:szCs w:val="22"/>
         </w:rPr>
-        <w:t>{{ Responsable</w:t>
+        <w:t>Dr. Gerardo Villacreses</w:t>
       </w:r>
       <w:proofErr w:type="gramEnd"/>
       <w:r>
@@ -106,7 +106,6 @@
           <w:sz w:val="22"/>
           <w:szCs w:val="22"/>
         </w:rPr>
-        <w:t xml:space="preserve"> }}</w:t>
       </w:r>
     </w:p>
     <w:p>
@@ -127,7 +126,7 @@
           <w:sz w:val="22"/>
           <w:szCs w:val="22"/>
         </w:rPr>
-        <w:t>Comisión Académica del Programa</w:t>
+        <w:t>Director de Posgrado, Cooperación y Relaciones Internacionales</w:t>
       </w:r>
     </w:p>
     <w:p>
@@ -150,7 +149,7 @@
           <w:sz w:val="22"/>
           <w:szCs w:val="22"/>
         </w:rPr>
-        <w:t xml:space="preserve">De la </w:t>
+        <w:t>Universidad Laica Eloy Alfaro de Manabí</w:t>
       </w:r>
       <w:proofErr w:type="gramStart"/>
       <w:r>
@@ -160,7 +159,6 @@
           <w:sz w:val="22"/>
           <w:szCs w:val="22"/>
         </w:rPr>
-        <w:t>{{ MAESTRIA</w:t>
       </w:r>
       <w:proofErr w:type="gramEnd"/>
       <w:r>
@@ -170,7 +168,6 @@
           <w:sz w:val="22"/>
           <w:szCs w:val="22"/>
         </w:rPr>
-        <w:t xml:space="preserve"> }}</w:t>
       </w:r>
       <w:r>
         <w:rPr>
@@ -180,7 +177,6 @@
           <w:szCs w:val="22"/>
           <w:lang w:val="es-EC"/>
         </w:rPr>
-        <w:t>.</w:t>
       </w:r>
     </w:p>
     <w:p>

</xml_diff>